<commit_message>
Updated report and added cad folder
</commit_message>
<xml_diff>
--- a/Reports/Final Report.docx
+++ b/Reports/Final Report.docx
@@ -1602,7 +1602,7 @@
         <w:pStyle w:val="Heading1"/>
       </w:pPr>
       <w:r>
-        <w:t>Changelog</w:t>
+        <w:t>Design and Changelog</w:t>
       </w:r>
     </w:p>
     <w:p/>
@@ -1651,13 +1651,13 @@
         <w:tblLook w:val="04A0" w:firstRow="1" w:lastRow="0" w:firstColumn="1" w:lastColumn="0" w:noHBand="0" w:noVBand="1"/>
       </w:tblPr>
       <w:tblGrid>
-        <w:gridCol w:w="1696"/>
-        <w:gridCol w:w="9094"/>
+        <w:gridCol w:w="1271"/>
+        <w:gridCol w:w="9519"/>
       </w:tblGrid>
       <w:tr>
         <w:tc>
           <w:tcPr>
-            <w:tcW w:w="1696" w:type="dxa"/>
+            <w:tcW w:w="1271" w:type="dxa"/>
           </w:tcPr>
           <w:p>
             <w:r>
@@ -1667,7 +1667,7 @@
         </w:tc>
         <w:tc>
           <w:tcPr>
-            <w:tcW w:w="9094" w:type="dxa"/>
+            <w:tcW w:w="9519" w:type="dxa"/>
           </w:tcPr>
           <w:p>
             <w:r>
@@ -1778,7 +1778,7 @@
       <w:tr>
         <w:tc>
           <w:tcPr>
-            <w:tcW w:w="1696" w:type="dxa"/>
+            <w:tcW w:w="1271" w:type="dxa"/>
           </w:tcPr>
           <w:p>
             <w:r>
@@ -1789,7 +1789,7 @@
         </w:tc>
         <w:tc>
           <w:tcPr>
-            <w:tcW w:w="9094" w:type="dxa"/>
+            <w:tcW w:w="9519" w:type="dxa"/>
           </w:tcPr>
           <w:p>
             <w:r>
@@ -1889,6 +1889,53 @@
         <w:t>Plane</w:t>
       </w:r>
     </w:p>
+    <w:tbl>
+      <w:tblPr>
+        <w:tblStyle w:val="TableGrid"/>
+        <w:tblW w:w="0" w:type="auto"/>
+        <w:tblLook w:val="04A0" w:firstRow="1" w:lastRow="0" w:firstColumn="1" w:lastColumn="0" w:noHBand="0" w:noVBand="1"/>
+      </w:tblPr>
+      <w:tblGrid>
+        <w:gridCol w:w="1838"/>
+        <w:gridCol w:w="8952"/>
+      </w:tblGrid>
+      <w:tr>
+        <w:tc>
+          <w:tcPr>
+            <w:tcW w:w="1838" w:type="dxa"/>
+          </w:tcPr>
+          <w:p>
+            <w:r>
+              <w:t>V1 (Mock Plane)</w:t>
+            </w:r>
+          </w:p>
+        </w:tc>
+        <w:tc>
+          <w:tcPr>
+            <w:tcW w:w="8952" w:type="dxa"/>
+          </w:tcPr>
+          <w:p/>
+        </w:tc>
+      </w:tr>
+      <w:tr>
+        <w:tc>
+          <w:tcPr>
+            <w:tcW w:w="1838" w:type="dxa"/>
+          </w:tcPr>
+          <w:p>
+            <w:r>
+              <w:t>V2 (Final)</w:t>
+            </w:r>
+          </w:p>
+        </w:tc>
+        <w:tc>
+          <w:tcPr>
+            <w:tcW w:w="8952" w:type="dxa"/>
+          </w:tcPr>
+          <w:p/>
+        </w:tc>
+      </w:tr>
+    </w:tbl>
     <w:p/>
     <w:p>
       <w:pPr>

</xml_diff>